<commit_message>
adding kids gaming, career reated page
</commit_message>
<xml_diff>
--- a/Computer_Course.docx
+++ b/Computer_Course.docx
@@ -206,349 +206,328 @@
         <w:t xml:space="preserve"> (Diploma in Office Expert &amp; Publishing) – Basic to Semi Advance about computer – 12 Months [**Most Demanding]</w:t>
       </w:r>
       <w:r>
+        <w:t xml:space="preserve"> – Rs. 8000/-</w:t>
+      </w:r>
+    </w:p>
+    <w:p>
+      <w:pPr>
+        <w:pStyle w:val="ListParagraph"/>
+        <w:numPr>
+          <w:ilvl w:val="1"/>
+          <w:numId w:val="2"/>
+        </w:numPr>
+      </w:pPr>
+      <w:r>
+        <w:t>ADOAP (Advance Diploma in Office Accounting Power) – Advance about Computer – 12 Month</w:t>
+      </w:r>
+      <w:r>
+        <w:t xml:space="preserve"> - Rs. 15000/-</w:t>
+      </w:r>
+    </w:p>
+    <w:p>
+      <w:pPr>
+        <w:pStyle w:val="ListParagraph"/>
+        <w:numPr>
+          <w:ilvl w:val="1"/>
+          <w:numId w:val="2"/>
+        </w:numPr>
+      </w:pPr>
+      <w:r>
+        <w:t xml:space="preserve">CCCO (Certificate Course </w:t>
+      </w:r>
+      <w:r>
+        <w:t>for</w:t>
+      </w:r>
+      <w:r>
+        <w:t xml:space="preserve"> Computer Operation) – Office Work purpose, MS Office </w:t>
+      </w:r>
+      <w:r>
+        <w:t>–</w:t>
+      </w:r>
+      <w:r>
         <w:t xml:space="preserve"> </w:t>
       </w:r>
       <w:r>
-        <w:t>– Rs. 8000/-</w:t>
-      </w:r>
-    </w:p>
-    <w:p>
-      <w:pPr>
-        <w:pStyle w:val="ListParagraph"/>
-        <w:numPr>
-          <w:ilvl w:val="1"/>
-          <w:numId w:val="2"/>
-        </w:numPr>
-      </w:pPr>
-      <w:r>
-        <w:t>ADOAP (Advance Diploma in Office Accounting Power) – Advance about Computer – 12 Month</w:t>
-      </w:r>
-      <w:r>
-        <w:t xml:space="preserve"> - </w:t>
-      </w:r>
-      <w:r>
-        <w:t>Rs. 15000/-</w:t>
-      </w:r>
-    </w:p>
-    <w:p>
-      <w:pPr>
-        <w:pStyle w:val="ListParagraph"/>
-        <w:numPr>
-          <w:ilvl w:val="1"/>
-          <w:numId w:val="2"/>
-        </w:numPr>
-      </w:pPr>
-      <w:r>
-        <w:t xml:space="preserve">CCCO (Certificate Course </w:t>
-      </w:r>
-      <w:r>
-        <w:t>for</w:t>
-      </w:r>
-      <w:r>
-        <w:t xml:space="preserve"> Computer Operation) – Office Work purpose, MS Office </w:t>
-      </w:r>
-      <w:r>
-        <w:t>–</w:t>
+        <w:t>3 Months</w:t>
+      </w:r>
+      <w:r>
+        <w:t xml:space="preserve"> – Rs 3000/-</w:t>
+      </w:r>
+    </w:p>
+    <w:p>
+      <w:pPr>
+        <w:pStyle w:val="ListParagraph"/>
+        <w:numPr>
+          <w:ilvl w:val="1"/>
+          <w:numId w:val="2"/>
+        </w:numPr>
+      </w:pPr>
+      <w:r>
+        <w:t>DDTP (Diploma in Desk Top Publication)</w:t>
       </w:r>
       <w:r>
         <w:t xml:space="preserve"> </w:t>
       </w:r>
       <w:r>
-        <w:t>3 Months</w:t>
-      </w:r>
-      <w:r>
-        <w:t xml:space="preserve"> – Rs 3000/-</w:t>
-      </w:r>
-    </w:p>
-    <w:p>
-      <w:pPr>
-        <w:pStyle w:val="ListParagraph"/>
-        <w:numPr>
-          <w:ilvl w:val="1"/>
-          <w:numId w:val="2"/>
-        </w:numPr>
-      </w:pPr>
-      <w:r>
-        <w:t>DDTP (Diploma in Desk Top Publication)</w:t>
+        <w:t>- Office Work purpose, MS Office – 6 Months</w:t>
+      </w:r>
+      <w:r>
+        <w:t xml:space="preserve"> – Rs 5000/-</w:t>
+      </w:r>
+    </w:p>
+    <w:p>
+      <w:pPr>
+        <w:pStyle w:val="ListParagraph"/>
+        <w:numPr>
+          <w:ilvl w:val="1"/>
+          <w:numId w:val="2"/>
+        </w:numPr>
+      </w:pPr>
+      <w:r>
+        <w:t xml:space="preserve">CCBA (Certificate in Computer Basic Application) </w:t>
+      </w:r>
+      <w:r>
+        <w:t>– Start from basic, OS, MS Office, Internet, Data entry – 6 months</w:t>
+      </w:r>
+      <w:r>
+        <w:t xml:space="preserve"> – Rs 5000/-</w:t>
+      </w:r>
+    </w:p>
+    <w:p>
+      <w:pPr>
+        <w:pStyle w:val="ListParagraph"/>
+        <w:numPr>
+          <w:ilvl w:val="1"/>
+          <w:numId w:val="2"/>
+        </w:numPr>
+      </w:pPr>
+      <w:r>
+        <w:t>CDEE (Certificate in Data Entry Expert) – Data Entry – 6 Months</w:t>
+      </w:r>
+      <w:r>
+        <w:t xml:space="preserve"> – Rs 5000/-</w:t>
+      </w:r>
+    </w:p>
+    <w:p>
+      <w:pPr>
+        <w:pStyle w:val="ListParagraph"/>
+        <w:numPr>
+          <w:ilvl w:val="0"/>
+          <w:numId w:val="2"/>
+        </w:numPr>
+      </w:pPr>
+      <w:r>
+        <w:t xml:space="preserve">Kids Computer </w:t>
+      </w:r>
+    </w:p>
+    <w:p>
+      <w:pPr>
+        <w:pStyle w:val="ListParagraph"/>
+        <w:numPr>
+          <w:ilvl w:val="1"/>
+          <w:numId w:val="2"/>
+        </w:numPr>
+      </w:pPr>
+      <w:r>
+        <w:t xml:space="preserve">Kids Programming </w:t>
+      </w:r>
+      <w:r>
+        <w:t>– Rs 5000/-</w:t>
+      </w:r>
+    </w:p>
+    <w:p>
+      <w:pPr>
+        <w:pStyle w:val="ListParagraph"/>
+        <w:numPr>
+          <w:ilvl w:val="1"/>
+          <w:numId w:val="2"/>
+        </w:numPr>
+      </w:pPr>
+      <w:r>
+        <w:t>Smart Kids – 3 years (after 10 years)</w:t>
+      </w:r>
+      <w:r>
+        <w:t xml:space="preserve"> – Rs.4000 per year</w:t>
+      </w:r>
+    </w:p>
+    <w:p>
+      <w:pPr>
+        <w:pStyle w:val="ListParagraph"/>
+        <w:numPr>
+          <w:ilvl w:val="1"/>
+          <w:numId w:val="2"/>
+        </w:numPr>
+      </w:pPr>
+      <w:r>
+        <w:t>ICGS Kids (Intensive Computer Guidance for Smart Kids) – 3 Year (below 10 years age)</w:t>
+      </w:r>
+      <w:r>
+        <w:t xml:space="preserve"> – Rs. 4000 per year</w:t>
+      </w:r>
+    </w:p>
+    <w:p>
+      <w:pPr>
+        <w:pStyle w:val="ListParagraph"/>
+        <w:numPr>
+          <w:ilvl w:val="0"/>
+          <w:numId w:val="2"/>
+        </w:numPr>
+      </w:pPr>
+      <w:r>
+        <w:t xml:space="preserve">AI Course </w:t>
+      </w:r>
+    </w:p>
+    <w:p>
+      <w:pPr>
+        <w:pStyle w:val="ListParagraph"/>
+        <w:numPr>
+          <w:ilvl w:val="1"/>
+          <w:numId w:val="2"/>
+        </w:numPr>
+      </w:pPr>
+      <w:r>
+        <w:t>DGAIA &amp; PPE (</w:t>
+      </w:r>
+      <w:r>
+        <w:t>Diploma in Generative AI Architecture &amp; Professional Prompt Engineering</w:t>
+      </w:r>
+      <w:r>
+        <w:t>) – AI explore – 12 months</w:t>
       </w:r>
       <w:r>
         <w:t xml:space="preserve"> </w:t>
       </w:r>
       <w:r>
-        <w:t>- Office Work purpose, MS Office – 6 Months</w:t>
-      </w:r>
-      <w:r>
-        <w:t xml:space="preserve"> – Rs 5000/-</w:t>
-      </w:r>
-    </w:p>
-    <w:p>
-      <w:pPr>
-        <w:pStyle w:val="ListParagraph"/>
-        <w:numPr>
-          <w:ilvl w:val="1"/>
-          <w:numId w:val="2"/>
-        </w:numPr>
-      </w:pPr>
-      <w:r>
-        <w:t xml:space="preserve">CCBA (Certificate in Computer Basic Application) </w:t>
-      </w:r>
-      <w:r>
-        <w:t>– Start from basic, OS, MS Office, Internet, Data entry – 6 months</w:t>
-      </w:r>
-      <w:r>
-        <w:t xml:space="preserve"> – Rs 5000/-</w:t>
-      </w:r>
-    </w:p>
-    <w:p>
-      <w:pPr>
-        <w:pStyle w:val="ListParagraph"/>
-        <w:numPr>
-          <w:ilvl w:val="1"/>
-          <w:numId w:val="2"/>
-        </w:numPr>
-      </w:pPr>
-      <w:r>
-        <w:t>CDEE (Certificate in Data Entry Expert) – Data Entry – 6 Months</w:t>
-      </w:r>
-      <w:r>
-        <w:t xml:space="preserve"> – Rs 5000/-</w:t>
-      </w:r>
-    </w:p>
-    <w:p>
-      <w:pPr>
-        <w:pStyle w:val="ListParagraph"/>
-        <w:numPr>
-          <w:ilvl w:val="0"/>
-          <w:numId w:val="2"/>
-        </w:numPr>
-      </w:pPr>
-      <w:r>
-        <w:t xml:space="preserve">Kids Computer </w:t>
-      </w:r>
-    </w:p>
-    <w:p>
-      <w:pPr>
-        <w:pStyle w:val="ListParagraph"/>
-        <w:numPr>
-          <w:ilvl w:val="1"/>
-          <w:numId w:val="2"/>
-        </w:numPr>
-      </w:pPr>
-      <w:r>
-        <w:t xml:space="preserve">Kids Programming </w:t>
-      </w:r>
-      <w:r>
-        <w:t>– Rs 5000/-</w:t>
-      </w:r>
-    </w:p>
-    <w:p>
-      <w:pPr>
-        <w:pStyle w:val="ListParagraph"/>
-        <w:numPr>
-          <w:ilvl w:val="1"/>
-          <w:numId w:val="2"/>
-        </w:numPr>
-      </w:pPr>
-      <w:r>
-        <w:t>Smart Kids – 3 years (after 10 years)</w:t>
-      </w:r>
-      <w:r>
-        <w:t xml:space="preserve"> – Rs.4000 per year</w:t>
-      </w:r>
-    </w:p>
-    <w:p>
-      <w:pPr>
-        <w:pStyle w:val="ListParagraph"/>
-        <w:numPr>
-          <w:ilvl w:val="1"/>
-          <w:numId w:val="2"/>
-        </w:numPr>
-      </w:pPr>
-      <w:r>
-        <w:t>ICGS Kids (Intensive Computer Guidance for Smart Kids) – 3 Year (below 10 years age)</w:t>
-      </w:r>
-      <w:r>
-        <w:t xml:space="preserve"> – Rs. 4000 per year</w:t>
-      </w:r>
-    </w:p>
-    <w:p>
-      <w:pPr>
-        <w:pStyle w:val="ListParagraph"/>
-        <w:numPr>
-          <w:ilvl w:val="0"/>
-          <w:numId w:val="2"/>
-        </w:numPr>
-      </w:pPr>
-      <w:r>
-        <w:t xml:space="preserve">AI Course </w:t>
-      </w:r>
-    </w:p>
-    <w:p>
-      <w:pPr>
-        <w:pStyle w:val="ListParagraph"/>
-        <w:numPr>
-          <w:ilvl w:val="1"/>
-          <w:numId w:val="2"/>
-        </w:numPr>
-      </w:pPr>
-      <w:r>
-        <w:t>DGAIA &amp; PPE (</w:t>
-      </w:r>
-      <w:r>
-        <w:t>Diploma in Generative AI Architecture &amp; Professional Prompt Engineering</w:t>
-      </w:r>
-      <w:r>
-        <w:t>) – AI explore – 12 months</w:t>
+        <w:t>[** Most popular]</w:t>
+      </w:r>
+      <w:r>
+        <w:t xml:space="preserve"> – Rs. 40000/-</w:t>
+      </w:r>
+    </w:p>
+    <w:p>
+      <w:pPr>
+        <w:pStyle w:val="ListParagraph"/>
+        <w:numPr>
+          <w:ilvl w:val="1"/>
+          <w:numId w:val="2"/>
+        </w:numPr>
+      </w:pPr>
+      <w:r>
+        <w:t>ADAOBM (</w:t>
+      </w:r>
+      <w:r>
+        <w:t>Advanced Diploma in AI Operations for Business &amp; Media</w:t>
+      </w:r>
+      <w:r>
+        <w:t>) – AI explore – 12 Months</w:t>
       </w:r>
       <w:r>
         <w:t xml:space="preserve"> </w:t>
       </w:r>
       <w:r>
-        <w:t>[** Most popular]</w:t>
-      </w:r>
-      <w:r>
-        <w:t xml:space="preserve"> – Rs. 40000/-</w:t>
-      </w:r>
-    </w:p>
-    <w:p>
-      <w:pPr>
-        <w:pStyle w:val="ListParagraph"/>
-        <w:numPr>
-          <w:ilvl w:val="1"/>
-          <w:numId w:val="2"/>
-        </w:numPr>
-      </w:pPr>
-      <w:r>
-        <w:t>ADAOBM (</w:t>
-      </w:r>
-      <w:r>
-        <w:t>Advanced Diploma in AI Operations for Business &amp; Media</w:t>
-      </w:r>
-      <w:r>
-        <w:t>) – AI explore – 12 Months</w:t>
+        <w:t>– Rs 25000/-</w:t>
+      </w:r>
+    </w:p>
+    <w:p>
+      <w:pPr>
+        <w:pStyle w:val="ListParagraph"/>
+        <w:numPr>
+          <w:ilvl w:val="1"/>
+          <w:numId w:val="2"/>
+        </w:numPr>
+      </w:pPr>
+      <w:r>
+        <w:t>MMMGAI (</w:t>
+      </w:r>
+      <w:r>
+        <w:t>Mastery in Multi-Modal Gen-AI</w:t>
+      </w:r>
+      <w:r>
+        <w:t xml:space="preserve">: </w:t>
+      </w:r>
+      <w:r>
+        <w:t>Text, Image, Voice, and Video Solutions</w:t>
+      </w:r>
+      <w:r>
+        <w:t>) – Content with AI – 12 Months</w:t>
+      </w:r>
+      <w:r>
+        <w:t xml:space="preserve"> - Rs 35000/-</w:t>
+      </w:r>
+    </w:p>
+    <w:p>
+      <w:pPr>
+        <w:pStyle w:val="ListParagraph"/>
+        <w:numPr>
+          <w:ilvl w:val="1"/>
+          <w:numId w:val="2"/>
+        </w:numPr>
+      </w:pPr>
+      <w:r>
+        <w:t xml:space="preserve">CPAI </w:t>
+      </w:r>
+      <w:r>
+        <w:t>(</w:t>
+      </w:r>
+      <w:r>
+        <w:t>Certificate in Professional AI</w:t>
+      </w:r>
+      <w:r>
+        <w:t>) – AI knowledge – 6 months</w:t>
+      </w:r>
+      <w:r>
+        <w:t xml:space="preserve"> – Rs 15000/-</w:t>
+      </w:r>
+    </w:p>
+    <w:p>
+      <w:pPr>
+        <w:pStyle w:val="ListParagraph"/>
+        <w:numPr>
+          <w:ilvl w:val="1"/>
+          <w:numId w:val="2"/>
+        </w:numPr>
+      </w:pPr>
+      <w:r>
+        <w:t xml:space="preserve">AI-WORK </w:t>
+      </w:r>
+      <w:r>
+        <w:t>(</w:t>
+      </w:r>
+      <w:r>
+        <w:t>AI for Official &amp; Routine Knowledge</w:t>
+      </w:r>
+      <w:r>
+        <w:t>) – Daily AI work use – 6 months</w:t>
+      </w:r>
+      <w:r>
+        <w:t xml:space="preserve"> – Rs 15000/-</w:t>
+      </w:r>
+    </w:p>
+    <w:p>
+      <w:pPr>
+        <w:pStyle w:val="ListParagraph"/>
+        <w:numPr>
+          <w:ilvl w:val="1"/>
+          <w:numId w:val="2"/>
+        </w:numPr>
+      </w:pPr>
+      <w:r>
+        <w:t>AI-EWSM</w:t>
       </w:r>
       <w:r>
         <w:t xml:space="preserve"> </w:t>
       </w:r>
       <w:r>
-        <w:t>– Rs 25000/-</w:t>
-      </w:r>
-    </w:p>
-    <w:p>
-      <w:pPr>
-        <w:pStyle w:val="ListParagraph"/>
-        <w:numPr>
-          <w:ilvl w:val="1"/>
-          <w:numId w:val="2"/>
-        </w:numPr>
-      </w:pPr>
-      <w:r>
-        <w:t>MMMGAI (</w:t>
-      </w:r>
-      <w:r>
-        <w:t>Mastery in Multi-Modal Gen-AI</w:t>
-      </w:r>
-      <w:r>
-        <w:t xml:space="preserve">: </w:t>
-      </w:r>
-      <w:r>
-        <w:t>Text, Image, Voice, and Video Solutions</w:t>
-      </w:r>
-      <w:r>
-        <w:t>) – Content with AI – 12 Months</w:t>
-      </w:r>
-      <w:r>
-        <w:t xml:space="preserve"> - </w:t>
-      </w:r>
-      <w:r>
-        <w:t xml:space="preserve">Rs </w:t>
-      </w:r>
-      <w:r>
-        <w:t>3</w:t>
-      </w:r>
-      <w:r>
-        <w:t>5000/-</w:t>
-      </w:r>
-    </w:p>
-    <w:p>
-      <w:pPr>
-        <w:pStyle w:val="ListParagraph"/>
-        <w:numPr>
-          <w:ilvl w:val="1"/>
-          <w:numId w:val="2"/>
-        </w:numPr>
-      </w:pPr>
-      <w:r>
-        <w:t xml:space="preserve">CPAI </w:t>
-      </w:r>
-      <w:r>
         <w:t>(</w:t>
       </w:r>
       <w:r>
-        <w:t>Certificate in Professional AI</w:t>
-      </w:r>
-      <w:r>
-        <w:t>) – AI knowledge – 6 months</w:t>
+        <w:t>AI Essentials for Work &amp; Social Media</w:t>
+      </w:r>
+      <w:r>
+        <w:t>) – Ai for Social Media – 6 Months</w:t>
       </w:r>
       <w:r>
         <w:t xml:space="preserve"> – Rs 15000/-</w:t>
-      </w:r>
-    </w:p>
-    <w:p>
-      <w:pPr>
-        <w:pStyle w:val="ListParagraph"/>
-        <w:numPr>
-          <w:ilvl w:val="1"/>
-          <w:numId w:val="2"/>
-        </w:numPr>
-      </w:pPr>
-      <w:r>
-        <w:t xml:space="preserve">AI-WORK </w:t>
-      </w:r>
-      <w:r>
-        <w:t>(</w:t>
-      </w:r>
-      <w:r>
-        <w:t>AI for Official &amp; Routine Knowledge</w:t>
-      </w:r>
-      <w:r>
-        <w:t>) – Daily AI work use – 6 months</w:t>
-      </w:r>
-      <w:r>
-        <w:t xml:space="preserve"> </w:t>
-      </w:r>
-      <w:r>
-        <w:t>– Rs 15000/-</w:t>
-      </w:r>
-    </w:p>
-    <w:p>
-      <w:pPr>
-        <w:pStyle w:val="ListParagraph"/>
-        <w:numPr>
-          <w:ilvl w:val="1"/>
-          <w:numId w:val="2"/>
-        </w:numPr>
-      </w:pPr>
-      <w:r>
-        <w:t>AI-EWSM</w:t>
-      </w:r>
-      <w:r>
-        <w:t xml:space="preserve"> </w:t>
-      </w:r>
-      <w:r>
-        <w:t>(</w:t>
-      </w:r>
-      <w:r>
-        <w:t>AI Essentials for Work &amp; Social Media</w:t>
-      </w:r>
-      <w:r>
-        <w:t>) – Ai for Social Media – 6 Months</w:t>
-      </w:r>
-      <w:r>
-        <w:t xml:space="preserve"> </w:t>
-      </w:r>
-      <w:r>
-        <w:t>– Rs 15000/-</w:t>
       </w:r>
     </w:p>
     <w:p>
@@ -909,19 +888,7 @@
           <w:rPr>
             <w:rStyle w:val="Hyperlink"/>
           </w:rPr>
-          <w:t>https://pixabay.com/imag</w:t>
-        </w:r>
-        <w:r>
-          <w:rPr>
-            <w:rStyle w:val="Hyperlink"/>
-          </w:rPr>
-          <w:t>e</w:t>
-        </w:r>
-        <w:r>
-          <w:rPr>
-            <w:rStyle w:val="Hyperlink"/>
-          </w:rPr>
-          <w:t>s/download/x-63527_1920.jpg</w:t>
+          <w:t>https://pixabay.com/images/download/x-63527_1920.jpg</w:t>
         </w:r>
       </w:hyperlink>
       <w:r>
@@ -1017,10 +984,119 @@
       </w:hyperlink>
     </w:p>
     <w:p>
-      <w:r>
-        <w:t>https://cdn.pixabay.com/photo/2022/04/04/16/41/technology-7111795_1280.jpg</w:t>
-      </w:r>
-    </w:p>
+      <w:hyperlink r:id="rId15" w:history="1">
+        <w:r>
+          <w:rPr>
+            <w:rStyle w:val="Hyperlink"/>
+          </w:rPr>
+          <w:t>https://cdn.pixabay.com/photo/2022/04/04/16/41/technology-7111795_1280.jpg</w:t>
+        </w:r>
+      </w:hyperlink>
+    </w:p>
+    <w:p/>
+    <w:p/>
+    <w:p>
+      <w:hyperlink r:id="rId16" w:history="1">
+        <w:r>
+          <w:rPr>
+            <w:rStyle w:val="Hyperlink"/>
+          </w:rPr>
+          <w:t>https://cdn.pixabay.com/photo/2019/07/03/05/41/entrepreneur-4313685_1280.jpg</w:t>
+        </w:r>
+      </w:hyperlink>
+    </w:p>
+    <w:p>
+      <w:hyperlink r:id="rId17" w:history="1">
+        <w:r>
+          <w:rPr>
+            <w:rStyle w:val="Hyperlink"/>
+          </w:rPr>
+          <w:t>https://cdn.pixabay.com/photo/2022/05/18/07/22/entrepreneur-7204663_1280.jpg</w:t>
+        </w:r>
+      </w:hyperlink>
+    </w:p>
+    <w:p>
+      <w:hyperlink r:id="rId18" w:history="1">
+        <w:r>
+          <w:rPr>
+            <w:rStyle w:val="Hyperlink"/>
+          </w:rPr>
+          <w:t>https://cdn.pixabay.com/photo/2015/07/17/22/43/student-849824_1280.jpg</w:t>
+        </w:r>
+      </w:hyperlink>
+    </w:p>
+    <w:p>
+      <w:hyperlink r:id="rId19" w:history="1">
+        <w:r>
+          <w:rPr>
+            <w:rStyle w:val="Hyperlink"/>
+          </w:rPr>
+          <w:t>https://cdn.pixabay.com/photo/2015/09/04/23/28/wordpress-923188_1280.jpg</w:t>
+        </w:r>
+      </w:hyperlink>
+    </w:p>
+    <w:p>
+      <w:hyperlink r:id="rId20" w:history="1">
+        <w:r>
+          <w:rPr>
+            <w:rStyle w:val="Hyperlink"/>
+          </w:rPr>
+          <w:t>https://cdn.pixabay.com/photo/2015/01/08/18/12/startup-593299_1280.jpg</w:t>
+        </w:r>
+      </w:hyperlink>
+    </w:p>
+    <w:p>
+      <w:hyperlink r:id="rId21" w:history="1">
+        <w:r>
+          <w:rPr>
+            <w:rStyle w:val="Hyperlink"/>
+          </w:rPr>
+          <w:t>https://cdn.pixabay.com/photo/2017/05/31/11/17/office-2360063_1280.jpg</w:t>
+        </w:r>
+      </w:hyperlink>
+    </w:p>
+    <w:p>
+      <w:hyperlink r:id="rId22" w:history="1">
+        <w:r>
+          <w:rPr>
+            <w:rStyle w:val="Hyperlink"/>
+          </w:rPr>
+          <w:t>https://cdn.pixabay.com/photo/2015/01/09/11/08/startup-594090_1280.jpg</w:t>
+        </w:r>
+      </w:hyperlink>
+    </w:p>
+    <w:p>
+      <w:hyperlink r:id="rId23" w:history="1">
+        <w:r>
+          <w:rPr>
+            <w:rStyle w:val="Hyperlink"/>
+          </w:rPr>
+          <w:t>https://cdn.pixabay.com/photo/2018/03/10/12/00/teamwork-3213924_1280.jpg</w:t>
+        </w:r>
+      </w:hyperlink>
+    </w:p>
+    <w:p>
+      <w:hyperlink r:id="rId24" w:history="1">
+        <w:r>
+          <w:rPr>
+            <w:rStyle w:val="Hyperlink"/>
+          </w:rPr>
+          <w:t>https://cdn.pixabay.com/photo/2017/01/14/10/56/people-1979261_1280.jpg</w:t>
+        </w:r>
+      </w:hyperlink>
+    </w:p>
+    <w:p>
+      <w:hyperlink r:id="rId25" w:history="1">
+        <w:r>
+          <w:rPr>
+            <w:rStyle w:val="Hyperlink"/>
+          </w:rPr>
+          <w:t>https://cdn.pixabay.com/photo/2015/01/08/18/11/laptops-593296_1280.jpg</w:t>
+        </w:r>
+      </w:hyperlink>
+    </w:p>
+    <w:p/>
+    <w:p/>
     <w:p/>
     <w:p>
       <w:r>
@@ -1278,6 +1354,7 @@
         </w:rPr>
       </w:pPr>
       <w:r>
+        <w:lastRenderedPageBreak/>
         <w:t>special-course.html</w:t>
       </w:r>
     </w:p>
@@ -1486,13 +1563,7 @@
         <w:sym w:font="Wingdings" w:char="F0E0"/>
       </w:r>
       <w:r>
-        <w:t xml:space="preserve"> (Folder: here are all </w:t>
-      </w:r>
-      <w:r>
-        <w:t>advance</w:t>
-      </w:r>
-      <w:r>
-        <w:t xml:space="preserve"> computer related docs located)</w:t>
+        <w:t xml:space="preserve"> (Folder: here are all advance computer related docs located)</w:t>
       </w:r>
     </w:p>
     <w:p>
@@ -1514,13 +1585,7 @@
         <w:sym w:font="Wingdings" w:char="F0E0"/>
       </w:r>
       <w:r>
-        <w:t xml:space="preserve"> (Folder: here are all </w:t>
-      </w:r>
-      <w:r>
-        <w:t>designing</w:t>
-      </w:r>
-      <w:r>
-        <w:t xml:space="preserve"> related docs located)</w:t>
+        <w:t xml:space="preserve"> (Folder: here are all designing related docs located)</w:t>
       </w:r>
     </w:p>
     <w:p>
@@ -1542,13 +1607,7 @@
         <w:sym w:font="Wingdings" w:char="F0E0"/>
       </w:r>
       <w:r>
-        <w:t xml:space="preserve"> (Folder: here are all </w:t>
-      </w:r>
-      <w:r>
-        <w:t>programming</w:t>
-      </w:r>
-      <w:r>
-        <w:t xml:space="preserve"> related docs located)</w:t>
+        <w:t xml:space="preserve"> (Folder: here are all programming related docs located)</w:t>
       </w:r>
     </w:p>
     <w:p>
@@ -1570,13 +1629,7 @@
         <w:sym w:font="Wingdings" w:char="F0E0"/>
       </w:r>
       <w:r>
-        <w:t xml:space="preserve"> (Folder: here are all </w:t>
-      </w:r>
-      <w:r>
-        <w:t>ai learning</w:t>
-      </w:r>
-      <w:r>
-        <w:t xml:space="preserve"> related docs located)</w:t>
+        <w:t xml:space="preserve"> (Folder: here are all ai learning related docs located)</w:t>
       </w:r>
     </w:p>
     <w:p>
@@ -1598,13 +1651,7 @@
         <w:sym w:font="Wingdings" w:char="F0E0"/>
       </w:r>
       <w:r>
-        <w:t xml:space="preserve"> (Folder: here are all </w:t>
-      </w:r>
-      <w:r>
-        <w:t>kids</w:t>
-      </w:r>
-      <w:r>
-        <w:t xml:space="preserve"> computer related docs located)</w:t>
+        <w:t xml:space="preserve"> (Folder: here are all kids computer related docs located)</w:t>
       </w:r>
     </w:p>
     <w:p>
@@ -1628,7 +1675,6 @@
     <w:p/>
     <w:p>
       <w:r>
-        <w:lastRenderedPageBreak/>
         <w:t>upgrade the config.js file and add this course image and also add course description. To centralize all data of the full site. I am also making page</w:t>
       </w:r>
       <w:r>
@@ -2595,6 +2641,7 @@
   <w:style w:type="character" w:default="1" w:styleId="DefaultParagraphFont">
     <w:name w:val="Default Paragraph Font"/>
     <w:uiPriority w:val="1"/>
+    <w:semiHidden/>
     <w:unhideWhenUsed/>
   </w:style>
   <w:style w:type="table" w:default="1" w:styleId="TableNormal">

</xml_diff>